<commit_message>
Corrigindo ex e fazendo novos
</commit_message>
<xml_diff>
--- a/POO_pytho/POO-CursoEmVideo/Notas Python.docx
+++ b/POO_pytho/POO-CursoEmVideo/Notas Python.docx
@@ -18,15 +18,903 @@
           <w:sz w:val="40"/>
           <w:szCs w:val="40"/>
         </w:rPr>
-        <w:t xml:space="preserve">AULA 5 </w:t>
-      </w:r>
-      <w:r>
+        <w:t>Python | Mundo 3</w:t>
+      </w:r>
+    </w:p>
+    <w:p>
+      <w:pPr>
+        <w:pStyle w:val="PargrafodaLista"/>
+        <w:numPr>
+          <w:ilvl w:val="0"/>
+          <w:numId w:val="4"/>
+        </w:numPr>
         <w:rPr>
           <w:b/>
           <w:bCs/>
           <w:sz w:val="40"/>
           <w:szCs w:val="40"/>
         </w:rPr>
+      </w:pPr>
+      <w:r>
+        <w:rPr>
+          <w:b/>
+          <w:bCs/>
+          <w:sz w:val="40"/>
+          <w:szCs w:val="40"/>
+        </w:rPr>
+        <w:t>VARIAVEIS COMPOSTAS (TUPLAS)</w:t>
+      </w:r>
+    </w:p>
+    <w:p>
+      <w:r>
+        <w:t>Vari</w:t>
+      </w:r>
+      <w:r>
+        <w:t>áveis simples são aquelas que só ocupam 1 de espaço na memória, enquanto as variáveis compostas(tuplas) podem guardar mais de um tipo de informação.</w:t>
+      </w:r>
+      <w:r>
+        <w:t xml:space="preserve"> Diferente de outras linguagens as tuplas aceita</w:t>
+      </w:r>
+      <w:r>
+        <w:t xml:space="preserve">m dados variados dentro dela, sejam eles em </w:t>
+      </w:r>
+      <w:proofErr w:type="spellStart"/>
+      <w:r>
+        <w:t>string</w:t>
+      </w:r>
+      <w:proofErr w:type="spellEnd"/>
+      <w:r>
+        <w:t xml:space="preserve"> ou </w:t>
+      </w:r>
+      <w:r>
+        <w:t>números</w:t>
+      </w:r>
+      <w:r>
+        <w:t xml:space="preserve">, </w:t>
+      </w:r>
+      <w:r>
+        <w:t>a</w:t>
+      </w:r>
+      <w:r>
+        <w:t xml:space="preserve">s </w:t>
+      </w:r>
+      <w:r>
+        <w:t>t</w:t>
+      </w:r>
+      <w:r>
+        <w:t>uplas</w:t>
+      </w:r>
+      <w:r>
+        <w:t xml:space="preserve"> quando criadas</w:t>
+      </w:r>
+      <w:r>
+        <w:t xml:space="preserve"> são </w:t>
+      </w:r>
+      <w:r>
+        <w:rPr>
+          <w:b/>
+          <w:bCs/>
+        </w:rPr>
+        <w:t>IMUTÁVEIS</w:t>
+      </w:r>
+      <w:r>
+        <w:rPr>
+          <w:b/>
+          <w:bCs/>
+        </w:rPr>
+        <w:t xml:space="preserve"> </w:t>
+      </w:r>
+      <w:r>
+        <w:t>você não consegue mudar o conteúdo</w:t>
+      </w:r>
+      <w:r>
+        <w:t xml:space="preserve"> dentro delas como em uma variável simples</w:t>
+      </w:r>
+      <w:r>
+        <w:t>.</w:t>
+      </w:r>
+    </w:p>
+    <w:p>
+      <w:pPr>
+        <w:rPr>
+          <w:b/>
+          <w:bCs/>
+          <w:i/>
+          <w:iCs/>
+        </w:rPr>
+      </w:pPr>
+      <w:r>
+        <w:rPr>
+          <w:i/>
+          <w:iCs/>
+        </w:rPr>
+        <w:t xml:space="preserve"> </w:t>
+      </w:r>
+      <w:r>
+        <w:rPr>
+          <w:b/>
+          <w:bCs/>
+          <w:i/>
+          <w:iCs/>
+        </w:rPr>
+        <w:t xml:space="preserve">    </w:t>
+      </w:r>
+      <w:proofErr w:type="spellStart"/>
+      <w:r>
+        <w:rPr>
+          <w:b/>
+          <w:bCs/>
+          <w:i/>
+          <w:iCs/>
+        </w:rPr>
+        <w:t>Ex</w:t>
+      </w:r>
+      <w:proofErr w:type="spellEnd"/>
+      <w:r>
+        <w:rPr>
+          <w:b/>
+          <w:bCs/>
+          <w:i/>
+          <w:iCs/>
+        </w:rPr>
+        <w:t>:</w:t>
+      </w:r>
+    </w:p>
+    <w:p>
+      <w:pPr>
+        <w:rPr>
+          <w:b/>
+          <w:bCs/>
+        </w:rPr>
+      </w:pPr>
+      <w:r>
+        <w:tab/>
+        <w:t>Lanche = Hamburguer</w:t>
+      </w:r>
+      <w:r>
+        <w:tab/>
+      </w:r>
+      <w:r>
+        <w:tab/>
+      </w:r>
+      <w:r>
+        <w:tab/>
+        <w:t xml:space="preserve">      </w:t>
+      </w:r>
+      <w:r>
+        <w:t xml:space="preserve"> -&gt; </w:t>
+      </w:r>
+      <w:r>
+        <w:rPr>
+          <w:b/>
+          <w:bCs/>
+        </w:rPr>
+        <w:t>variável simples</w:t>
+      </w:r>
+    </w:p>
+    <w:p>
+      <w:pPr>
+        <w:rPr>
+          <w:b/>
+          <w:bCs/>
+        </w:rPr>
+      </w:pPr>
+      <w:r>
+        <w:tab/>
+        <w:t xml:space="preserve">Lanche = Hamburguer, suco, pizza, pudim  </w:t>
+      </w:r>
+      <w:r>
+        <w:t xml:space="preserve">   </w:t>
+      </w:r>
+      <w:r>
+        <w:t xml:space="preserve">-&gt; </w:t>
+      </w:r>
+      <w:r>
+        <w:rPr>
+          <w:b/>
+          <w:bCs/>
+        </w:rPr>
+        <w:t>variável composta</w:t>
+      </w:r>
+    </w:p>
+    <w:p>
+      <w:pPr>
+        <w:rPr>
+          <w:b/>
+          <w:bCs/>
+          <w:i/>
+          <w:iCs/>
+        </w:rPr>
+      </w:pPr>
+      <w:r>
+        <w:rPr>
+          <w:b/>
+          <w:bCs/>
+        </w:rPr>
+        <w:t xml:space="preserve">    </w:t>
+      </w:r>
+      <w:proofErr w:type="spellStart"/>
+      <w:r>
+        <w:rPr>
+          <w:b/>
+          <w:bCs/>
+          <w:i/>
+          <w:iCs/>
+        </w:rPr>
+        <w:t>Ex</w:t>
+      </w:r>
+      <w:proofErr w:type="spellEnd"/>
+      <w:r>
+        <w:rPr>
+          <w:b/>
+          <w:bCs/>
+          <w:i/>
+          <w:iCs/>
+        </w:rPr>
+        <w:t>:</w:t>
+      </w:r>
+    </w:p>
+    <w:p>
+      <w:r>
+        <w:rPr>
+          <w:b/>
+          <w:bCs/>
+          <w:i/>
+          <w:iCs/>
+        </w:rPr>
+        <w:tab/>
+      </w:r>
+      <w:r>
+        <w:t>Pessoa = (</w:t>
+      </w:r>
+      <w:r>
+        <w:t>‘Pedro’, 23, ‘M’, 1.70</w:t>
+      </w:r>
+      <w:r>
+        <w:t>)</w:t>
+      </w:r>
+    </w:p>
+    <w:p>
+      <w:r>
+        <w:tab/>
+        <w:t>Print(pessoa)</w:t>
+      </w:r>
+    </w:p>
+    <w:p>
+      <w:pPr>
+        <w:pStyle w:val="PargrafodaLista"/>
+        <w:numPr>
+          <w:ilvl w:val="0"/>
+          <w:numId w:val="5"/>
+        </w:numPr>
+        <w:rPr>
+          <w:b/>
+          <w:bCs/>
+        </w:rPr>
+      </w:pPr>
+      <w:r>
+        <w:rPr>
+          <w:b/>
+          <w:bCs/>
+        </w:rPr>
+        <w:t>Métodos</w:t>
+      </w:r>
+      <w:r>
+        <w:rPr>
+          <w:b/>
+          <w:bCs/>
+        </w:rPr>
+        <w:t>/Objetos usados:</w:t>
+      </w:r>
+    </w:p>
+    <w:p>
+      <w:pPr>
+        <w:pStyle w:val="PargrafodaLista"/>
+        <w:rPr>
+          <w:b/>
+          <w:bCs/>
+        </w:rPr>
+      </w:pPr>
+    </w:p>
+    <w:p>
+      <w:pPr>
+        <w:pStyle w:val="PargrafodaLista"/>
+      </w:pPr>
+      <w:r>
+        <w:rPr>
+          <w:b/>
+          <w:bCs/>
+        </w:rPr>
+        <w:t>-</w:t>
+      </w:r>
+      <w:r>
+        <w:rPr>
+          <w:b/>
+          <w:bCs/>
+        </w:rPr>
+        <w:t>Método</w:t>
+      </w:r>
+      <w:r>
+        <w:t xml:space="preserve"> </w:t>
+      </w:r>
+      <w:proofErr w:type="spellStart"/>
+      <w:proofErr w:type="gramStart"/>
+      <w:r>
+        <w:rPr>
+          <w:b/>
+          <w:bCs/>
+        </w:rPr>
+        <w:t>len</w:t>
+      </w:r>
+      <w:proofErr w:type="spellEnd"/>
+      <w:r>
+        <w:rPr>
+          <w:b/>
+          <w:bCs/>
+        </w:rPr>
+        <w:t>( )</w:t>
+      </w:r>
+      <w:proofErr w:type="gramEnd"/>
+      <w:r>
+        <w:rPr>
+          <w:b/>
+          <w:bCs/>
+        </w:rPr>
+        <w:t xml:space="preserve"> : </w:t>
+      </w:r>
+      <w:r>
+        <w:t>é usado para determinar o comprimento de uma tupla, retorna o tamanho da tupla/lista</w:t>
+      </w:r>
+      <w:r>
+        <w:t>.</w:t>
+      </w:r>
+    </w:p>
+    <w:p>
+      <w:pPr>
+        <w:pStyle w:val="PargrafodaLista"/>
+      </w:pPr>
+      <w:r>
+        <w:rPr>
+          <w:b/>
+          <w:bCs/>
+        </w:rPr>
+        <w:t xml:space="preserve">- </w:t>
+      </w:r>
+      <w:r>
+        <w:rPr>
+          <w:b/>
+          <w:bCs/>
+        </w:rPr>
+        <w:t xml:space="preserve">Método </w:t>
+      </w:r>
+      <w:proofErr w:type="spellStart"/>
+      <w:proofErr w:type="gramStart"/>
+      <w:r>
+        <w:rPr>
+          <w:b/>
+          <w:bCs/>
+        </w:rPr>
+        <w:t>sorted</w:t>
+      </w:r>
+      <w:proofErr w:type="spellEnd"/>
+      <w:r>
+        <w:rPr>
+          <w:b/>
+          <w:bCs/>
+        </w:rPr>
+        <w:t>( )</w:t>
+      </w:r>
+      <w:proofErr w:type="gramEnd"/>
+      <w:r>
+        <w:rPr>
+          <w:b/>
+          <w:bCs/>
+        </w:rPr>
+        <w:t xml:space="preserve">: </w:t>
+      </w:r>
+      <w:r>
+        <w:t>Organiza a tupla do maior para o menor elemento.</w:t>
+      </w:r>
+    </w:p>
+    <w:p>
+      <w:pPr>
+        <w:pStyle w:val="PargrafodaLista"/>
+      </w:pPr>
+      <w:r>
+        <w:rPr>
+          <w:b/>
+          <w:bCs/>
+        </w:rPr>
+        <w:t xml:space="preserve">- </w:t>
+      </w:r>
+      <w:proofErr w:type="gramStart"/>
+      <w:r>
+        <w:rPr>
+          <w:b/>
+          <w:bCs/>
+        </w:rPr>
+        <w:t>Objeto .</w:t>
+      </w:r>
+      <w:proofErr w:type="spellStart"/>
+      <w:r>
+        <w:rPr>
+          <w:b/>
+          <w:bCs/>
+        </w:rPr>
+        <w:t>count</w:t>
+      </w:r>
+      <w:proofErr w:type="spellEnd"/>
+      <w:proofErr w:type="gramEnd"/>
+      <w:r>
+        <w:rPr>
+          <w:b/>
+          <w:bCs/>
+        </w:rPr>
+        <w:t xml:space="preserve">(“elemento que deseja procurar”): </w:t>
+      </w:r>
+      <w:r>
+        <w:t>Conta quantas vezes um elemento se repete dentro da tupla.</w:t>
+      </w:r>
+    </w:p>
+    <w:p>
+      <w:pPr>
+        <w:pStyle w:val="PargrafodaLista"/>
+      </w:pPr>
+      <w:r>
+        <w:rPr>
+          <w:b/>
+          <w:bCs/>
+        </w:rPr>
+        <w:t xml:space="preserve">- </w:t>
+      </w:r>
+      <w:proofErr w:type="gramStart"/>
+      <w:r>
+        <w:rPr>
+          <w:b/>
+          <w:bCs/>
+        </w:rPr>
+        <w:t>Objeto .index</w:t>
+      </w:r>
+      <w:proofErr w:type="gramEnd"/>
+      <w:r>
+        <w:rPr>
+          <w:b/>
+          <w:bCs/>
+        </w:rPr>
+        <w:t xml:space="preserve">((“elemento que deseja procurar”): </w:t>
+      </w:r>
+      <w:r>
+        <w:t xml:space="preserve">Procura na tupla o elemento dentro dos </w:t>
+      </w:r>
+      <w:proofErr w:type="gramStart"/>
+      <w:r>
+        <w:t>(  )</w:t>
+      </w:r>
+      <w:proofErr w:type="gramEnd"/>
+      <w:r>
+        <w:t xml:space="preserve"> e retorna </w:t>
+      </w:r>
+      <w:proofErr w:type="gramStart"/>
+      <w:r>
+        <w:t>a</w:t>
+      </w:r>
+      <w:proofErr w:type="gramEnd"/>
+      <w:r>
+        <w:t xml:space="preserve"> posição que ele está.</w:t>
+      </w:r>
+    </w:p>
+    <w:p>
+      <w:pPr>
+        <w:rPr>
+          <w:b/>
+          <w:bCs/>
+        </w:rPr>
+      </w:pPr>
+    </w:p>
+    <w:p>
+      <w:pPr>
+        <w:rPr>
+          <w:b/>
+          <w:bCs/>
+          <w:sz w:val="28"/>
+          <w:szCs w:val="28"/>
+        </w:rPr>
+      </w:pPr>
+      <w:r>
+        <w:rPr>
+          <w:b/>
+          <w:bCs/>
+          <w:sz w:val="28"/>
+          <w:szCs w:val="28"/>
+        </w:rPr>
+        <w:t xml:space="preserve">  - Formas de leitura das tuplas:</w:t>
+      </w:r>
+    </w:p>
+    <w:p>
+      <w:r>
+        <w:t>As tuplas podem ser lidas de várias formas diferentes, varia de uso de caso para caso, porém a mais comum de utilizar são usando laços, mais especificadamente o for, nele pode ser usados diferentes tipos de leituras:</w:t>
+      </w:r>
+    </w:p>
+    <w:p>
+      <w:r>
+        <w:t>--------------------------------------------------------------------------------------------------------</w:t>
+      </w:r>
+    </w:p>
+    <w:p>
+      <w:r>
+        <w:tab/>
+        <w:t xml:space="preserve">for </w:t>
+      </w:r>
+      <w:r>
+        <w:rPr>
+          <w:b/>
+          <w:bCs/>
+        </w:rPr>
+        <w:t>c</w:t>
+      </w:r>
+      <w:r>
+        <w:t xml:space="preserve"> in </w:t>
+      </w:r>
+      <w:r>
+        <w:rPr>
+          <w:b/>
+          <w:bCs/>
+        </w:rPr>
+        <w:t>lanche</w:t>
+      </w:r>
+      <w:r>
+        <w:rPr>
+          <w:b/>
+          <w:bCs/>
+        </w:rPr>
+        <w:t>:</w:t>
+      </w:r>
+      <w:r>
+        <w:t xml:space="preserve">               </w:t>
+      </w:r>
+    </w:p>
+    <w:p>
+      <w:r>
+        <w:tab/>
+      </w:r>
+      <w:r>
+        <w:tab/>
+        <w:t>print(c)</w:t>
+      </w:r>
+    </w:p>
+    <w:p>
+      <w:pPr>
+        <w:pStyle w:val="PargrafodaLista"/>
+        <w:numPr>
+          <w:ilvl w:val="0"/>
+          <w:numId w:val="3"/>
+        </w:numPr>
+      </w:pPr>
+      <w:r>
+        <w:t>Retorna tudo que está dentro da tupla.</w:t>
+      </w:r>
+    </w:p>
+    <w:p>
+      <w:r>
+        <w:lastRenderedPageBreak/>
+        <w:t>--------------------------------------------------------------------------------------------------------</w:t>
+      </w:r>
+    </w:p>
+    <w:p>
+      <w:pPr>
+        <w:ind w:firstLine="708"/>
+      </w:pPr>
+      <w:r>
+        <w:t xml:space="preserve">for </w:t>
+      </w:r>
+      <w:proofErr w:type="spellStart"/>
+      <w:r>
+        <w:rPr>
+          <w:b/>
+          <w:bCs/>
+        </w:rPr>
+        <w:t>cont</w:t>
+      </w:r>
+      <w:proofErr w:type="spellEnd"/>
+      <w:r>
+        <w:t xml:space="preserve"> in </w:t>
+      </w:r>
+      <w:proofErr w:type="gramStart"/>
+      <w:r>
+        <w:rPr>
+          <w:b/>
+          <w:bCs/>
+        </w:rPr>
+        <w:t>range(</w:t>
+      </w:r>
+      <w:proofErr w:type="gramEnd"/>
+      <w:r>
+        <w:rPr>
+          <w:b/>
+          <w:bCs/>
+        </w:rPr>
+        <w:t xml:space="preserve">0, </w:t>
+      </w:r>
+      <w:proofErr w:type="spellStart"/>
+      <w:r>
+        <w:rPr>
+          <w:b/>
+          <w:bCs/>
+        </w:rPr>
+        <w:t>len</w:t>
+      </w:r>
+      <w:proofErr w:type="spellEnd"/>
+      <w:r>
+        <w:rPr>
+          <w:b/>
+          <w:bCs/>
+        </w:rPr>
+        <w:t>(lanche)):</w:t>
+      </w:r>
+    </w:p>
+    <w:p>
+      <w:r>
+        <w:t xml:space="preserve">    </w:t>
+      </w:r>
+      <w:r>
+        <w:tab/>
+      </w:r>
+      <w:r>
+        <w:tab/>
+      </w:r>
+      <w:proofErr w:type="gramStart"/>
+      <w:r>
+        <w:t>print(</w:t>
+      </w:r>
+      <w:proofErr w:type="spellStart"/>
+      <w:proofErr w:type="gramEnd"/>
+      <w:r>
+        <w:t>f"Eu</w:t>
+      </w:r>
+      <w:proofErr w:type="spellEnd"/>
+      <w:r>
+        <w:t xml:space="preserve"> vou comer {lanche[</w:t>
+      </w:r>
+      <w:proofErr w:type="spellStart"/>
+      <w:r>
+        <w:t>cont</w:t>
+      </w:r>
+      <w:proofErr w:type="spellEnd"/>
+      <w:r>
+        <w:t>]} na posição {</w:t>
+      </w:r>
+      <w:proofErr w:type="spellStart"/>
+      <w:r>
+        <w:t>cont</w:t>
+      </w:r>
+      <w:proofErr w:type="spellEnd"/>
+      <w:r>
+        <w:t>}")</w:t>
+      </w:r>
+    </w:p>
+    <w:p>
+      <w:pPr>
+        <w:pStyle w:val="PargrafodaLista"/>
+        <w:numPr>
+          <w:ilvl w:val="0"/>
+          <w:numId w:val="2"/>
+        </w:numPr>
+      </w:pPr>
+      <w:r>
+        <w:t xml:space="preserve">Também retorna tudo que está dentro da </w:t>
+      </w:r>
+      <w:proofErr w:type="gramStart"/>
+      <w:r>
+        <w:t>tupla</w:t>
+      </w:r>
+      <w:proofErr w:type="gramEnd"/>
+      <w:r>
+        <w:t xml:space="preserve"> mas agora também é possível ver a posição de cada item.</w:t>
+      </w:r>
+    </w:p>
+    <w:p>
+      <w:pPr>
+        <w:pStyle w:val="PargrafodaLista"/>
+        <w:ind w:left="1068"/>
+      </w:pPr>
+    </w:p>
+    <w:p>
+      <w:r>
+        <w:t>--------------------------------------------------------------------------------------------------------</w:t>
+      </w:r>
+    </w:p>
+    <w:p>
+      <w:pPr>
+        <w:ind w:firstLine="708"/>
+      </w:pPr>
+      <w:r>
+        <w:t xml:space="preserve">for </w:t>
+      </w:r>
+      <w:proofErr w:type="spellStart"/>
+      <w:r>
+        <w:rPr>
+          <w:b/>
+          <w:bCs/>
+        </w:rPr>
+        <w:t>pos</w:t>
+      </w:r>
+      <w:proofErr w:type="spellEnd"/>
+      <w:r>
+        <w:rPr>
+          <w:b/>
+          <w:bCs/>
+        </w:rPr>
+        <w:t xml:space="preserve">, </w:t>
+      </w:r>
+      <w:r>
+        <w:rPr>
+          <w:b/>
+          <w:bCs/>
+        </w:rPr>
+        <w:t>c</w:t>
+      </w:r>
+      <w:r>
+        <w:t xml:space="preserve"> in </w:t>
+      </w:r>
+      <w:proofErr w:type="spellStart"/>
+      <w:r>
+        <w:rPr>
+          <w:b/>
+          <w:bCs/>
+        </w:rPr>
+        <w:t>enumerate</w:t>
+      </w:r>
+      <w:proofErr w:type="spellEnd"/>
+      <w:r>
+        <w:rPr>
+          <w:b/>
+          <w:bCs/>
+        </w:rPr>
+        <w:t>(lanche)</w:t>
+      </w:r>
+      <w:r>
+        <w:t>:</w:t>
+      </w:r>
+    </w:p>
+    <w:p>
+      <w:r>
+        <w:t xml:space="preserve">    </w:t>
+      </w:r>
+      <w:r>
+        <w:tab/>
+      </w:r>
+      <w:r>
+        <w:tab/>
+      </w:r>
+      <w:proofErr w:type="gramStart"/>
+      <w:r>
+        <w:t>print(</w:t>
+      </w:r>
+      <w:proofErr w:type="spellStart"/>
+      <w:proofErr w:type="gramEnd"/>
+      <w:r>
+        <w:t>f"Eu</w:t>
+      </w:r>
+      <w:proofErr w:type="spellEnd"/>
+      <w:r>
+        <w:t xml:space="preserve"> vou comer {c}")</w:t>
+      </w:r>
+    </w:p>
+    <w:p>
+      <w:pPr>
+        <w:pStyle w:val="PargrafodaLista"/>
+        <w:numPr>
+          <w:ilvl w:val="0"/>
+          <w:numId w:val="2"/>
+        </w:numPr>
+      </w:pPr>
+      <w:r>
+        <w:t>Uma maneira mais fácil de mostrar as posições de cada elemento da tupla</w:t>
+      </w:r>
+      <w:r>
+        <w:tab/>
+      </w:r>
+    </w:p>
+    <w:p>
+      <w:r>
+        <w:t>--------------------------------------------------------------------------------------------------------</w:t>
+      </w:r>
+    </w:p>
+    <w:p/>
+    <w:p/>
+    <w:p/>
+    <w:p/>
+    <w:p/>
+    <w:p/>
+    <w:p/>
+    <w:p/>
+    <w:p/>
+    <w:p/>
+    <w:p/>
+    <w:p/>
+    <w:p/>
+    <w:p/>
+    <w:p/>
+    <w:p/>
+    <w:p/>
+    <w:p>
+      <w:pPr>
+        <w:rPr>
+          <w:b/>
+          <w:bCs/>
+          <w:sz w:val="40"/>
+          <w:szCs w:val="40"/>
+        </w:rPr>
+      </w:pPr>
+    </w:p>
+    <w:p>
+      <w:pPr>
+        <w:rPr>
+          <w:b/>
+          <w:bCs/>
+          <w:sz w:val="40"/>
+          <w:szCs w:val="40"/>
+        </w:rPr>
+      </w:pPr>
+    </w:p>
+    <w:p>
+      <w:pPr>
+        <w:rPr>
+          <w:b/>
+          <w:bCs/>
+          <w:sz w:val="40"/>
+          <w:szCs w:val="40"/>
+        </w:rPr>
+      </w:pPr>
+      <w:r>
+        <w:rPr>
+          <w:b/>
+          <w:bCs/>
+          <w:sz w:val="40"/>
+          <w:szCs w:val="40"/>
+        </w:rPr>
+        <w:t xml:space="preserve">Python | </w:t>
+      </w:r>
+      <w:r>
+        <w:rPr>
+          <w:b/>
+          <w:bCs/>
+          <w:sz w:val="40"/>
+          <w:szCs w:val="40"/>
+        </w:rPr>
+        <w:t>Programação Orientada a Objetos</w:t>
+      </w:r>
+    </w:p>
+    <w:p>
+      <w:pPr>
+        <w:pStyle w:val="PargrafodaLista"/>
+        <w:numPr>
+          <w:ilvl w:val="0"/>
+          <w:numId w:val="4"/>
+        </w:numPr>
+        <w:rPr>
+          <w:b/>
+          <w:bCs/>
+          <w:sz w:val="40"/>
+          <w:szCs w:val="40"/>
+        </w:rPr>
+      </w:pPr>
+      <w:r>
+        <w:rPr>
+          <w:b/>
+          <w:bCs/>
+          <w:sz w:val="40"/>
+          <w:szCs w:val="40"/>
+        </w:rPr>
+        <w:t xml:space="preserve">AULA 5 </w:t>
+      </w:r>
+      <w:r>
+        <w:rPr>
+          <w:b/>
+          <w:bCs/>
+          <w:sz w:val="40"/>
+          <w:szCs w:val="40"/>
+        </w:rPr>
         <w:t>– Melhorando Classes</w:t>
       </w:r>
     </w:p>
@@ -55,6 +943,7 @@
           <w:szCs w:val="36"/>
         </w:rPr>
       </w:pPr>
+      <w:proofErr w:type="spellStart"/>
       <w:r>
         <w:rPr>
           <w:sz w:val="36"/>
@@ -69,6 +958,7 @@
         </w:rPr>
         <w:t>’s</w:t>
       </w:r>
+      <w:proofErr w:type="spellEnd"/>
       <w:r>
         <w:rPr>
           <w:sz w:val="36"/>
@@ -85,48 +975,188 @@
         <w:t xml:space="preserve"> métodos</w:t>
       </w:r>
       <w:r>
-        <w:t xml:space="preserve"> dunder(</w:t>
-      </w:r>
-      <w:r>
-        <w:t>double underline</w:t>
-      </w:r>
+        <w:t xml:space="preserve"> </w:t>
+      </w:r>
+      <w:proofErr w:type="spellStart"/>
+      <w:proofErr w:type="gramStart"/>
+      <w:r>
+        <w:t>dunder</w:t>
+      </w:r>
+      <w:proofErr w:type="spellEnd"/>
+      <w:r>
+        <w:t>(</w:t>
+      </w:r>
+      <w:proofErr w:type="spellStart"/>
+      <w:proofErr w:type="gramEnd"/>
+      <w:r>
+        <w:t>double</w:t>
+      </w:r>
+      <w:proofErr w:type="spellEnd"/>
+      <w:r>
+        <w:t xml:space="preserve"> </w:t>
+      </w:r>
+      <w:proofErr w:type="spellStart"/>
+      <w:r>
+        <w:t>underline</w:t>
+      </w:r>
+      <w:proofErr w:type="spellEnd"/>
       <w:r>
         <w:t>)</w:t>
       </w:r>
       <w:r>
-        <w:t xml:space="preserve"> são métodos</w:t>
+        <w:t xml:space="preserve"> são </w:t>
+      </w:r>
+      <w:proofErr w:type="gramStart"/>
+      <w:r>
+        <w:t>métodos</w:t>
       </w:r>
       <w:r>
         <w:t xml:space="preserve"> </w:t>
       </w:r>
       <w:r>
-        <w:t xml:space="preserve"> que </w:t>
-      </w:r>
-      <w:r>
-        <w:t>permitem personalizar</w:t>
-      </w:r>
-      <w:r>
-        <w:t xml:space="preserve">  o comportamento de classes e de objetos.</w:t>
+        <w:t xml:space="preserve"> que</w:t>
+      </w:r>
+      <w:proofErr w:type="gramEnd"/>
+      <w:r>
+        <w:t xml:space="preserve"> </w:t>
+      </w:r>
+      <w:r>
+        <w:t xml:space="preserve">permitem </w:t>
+      </w:r>
+      <w:proofErr w:type="gramStart"/>
+      <w:r>
+        <w:t>personalizar</w:t>
+      </w:r>
+      <w:r>
+        <w:t xml:space="preserve">  o</w:t>
+      </w:r>
+      <w:proofErr w:type="gramEnd"/>
+      <w:r>
+        <w:t xml:space="preserve"> comportamento de classes e de objetos.</w:t>
       </w:r>
     </w:p>
     <w:p>
       <w:r>
         <w:tab/>
       </w:r>
-      <w:r>
-        <w:rPr>
-          <w:b/>
-          <w:bCs/>
-          <w:i/>
-          <w:iCs/>
-        </w:rPr>
-        <w:t>Ex: print(int.__doc__) – Retorna a documentação do int e como utilizá-lo.</w:t>
-      </w:r>
-    </w:p>
-    <w:p>
-      <w:r>
-        <w:t>Também a como criar uma documentação para uma classe que você quiser, basta escrever um comentário abrindo e fechando ””” .</w:t>
-      </w:r>
+      <w:proofErr w:type="spellStart"/>
+      <w:r>
+        <w:rPr>
+          <w:b/>
+          <w:bCs/>
+          <w:i/>
+          <w:iCs/>
+        </w:rPr>
+        <w:t>Ex</w:t>
+      </w:r>
+      <w:proofErr w:type="spellEnd"/>
+      <w:r>
+        <w:rPr>
+          <w:b/>
+          <w:bCs/>
+          <w:i/>
+          <w:iCs/>
+        </w:rPr>
+        <w:t>: print(</w:t>
+      </w:r>
+      <w:proofErr w:type="spellStart"/>
+      <w:r>
+        <w:rPr>
+          <w:b/>
+          <w:bCs/>
+          <w:i/>
+          <w:iCs/>
+        </w:rPr>
+        <w:t>int</w:t>
+      </w:r>
+      <w:proofErr w:type="spellEnd"/>
+      <w:r>
+        <w:rPr>
+          <w:b/>
+          <w:bCs/>
+          <w:i/>
+          <w:iCs/>
+        </w:rPr>
+        <w:t>.__</w:t>
+      </w:r>
+      <w:proofErr w:type="spellStart"/>
+      <w:r>
+        <w:rPr>
+          <w:b/>
+          <w:bCs/>
+          <w:i/>
+          <w:iCs/>
+        </w:rPr>
+        <w:t>doc</w:t>
+      </w:r>
+      <w:proofErr w:type="spellEnd"/>
+      <w:r>
+        <w:rPr>
+          <w:b/>
+          <w:bCs/>
+          <w:i/>
+          <w:iCs/>
+        </w:rPr>
+        <w:t xml:space="preserve">__) – Retorna </w:t>
+      </w:r>
+      <w:proofErr w:type="gramStart"/>
+      <w:r>
+        <w:rPr>
+          <w:b/>
+          <w:bCs/>
+          <w:i/>
+          <w:iCs/>
+        </w:rPr>
+        <w:t>a</w:t>
+      </w:r>
+      <w:proofErr w:type="gramEnd"/>
+      <w:r>
+        <w:rPr>
+          <w:b/>
+          <w:bCs/>
+          <w:i/>
+          <w:iCs/>
+        </w:rPr>
+        <w:t xml:space="preserve"> documentação do </w:t>
+      </w:r>
+      <w:proofErr w:type="spellStart"/>
+      <w:r>
+        <w:rPr>
+          <w:b/>
+          <w:bCs/>
+          <w:i/>
+          <w:iCs/>
+        </w:rPr>
+        <w:t>int</w:t>
+      </w:r>
+      <w:proofErr w:type="spellEnd"/>
+      <w:r>
+        <w:rPr>
+          <w:b/>
+          <w:bCs/>
+          <w:i/>
+          <w:iCs/>
+        </w:rPr>
+        <w:t xml:space="preserve"> e como utilizá-lo.</w:t>
+      </w:r>
+    </w:p>
+    <w:p>
+      <w:r>
+        <w:t xml:space="preserve">Também a como criar uma documentação para uma classe que você quiser, basta escrever um comentário abrindo e </w:t>
+      </w:r>
+      <w:proofErr w:type="gramStart"/>
+      <w:r>
+        <w:t>fechando ”</w:t>
+      </w:r>
+      <w:proofErr w:type="gramEnd"/>
+      <w:r>
+        <w:t>”</w:t>
+      </w:r>
+      <w:proofErr w:type="gramStart"/>
+      <w:r>
+        <w:t>” .</w:t>
+      </w:r>
+      <w:proofErr w:type="gramEnd"/>
     </w:p>
     <w:p>
       <w:pPr>
@@ -145,7 +1175,26 @@
           <w:iCs/>
         </w:rPr>
         <w:tab/>
-        <w:t>Ex:  </w:t>
+      </w:r>
+      <w:proofErr w:type="spellStart"/>
+      <w:r>
+        <w:rPr>
+          <w:b/>
+          <w:bCs/>
+          <w:i/>
+          <w:iCs/>
+        </w:rPr>
+        <w:t>Ex</w:t>
+      </w:r>
+      <w:proofErr w:type="spellEnd"/>
+      <w:r>
+        <w:rPr>
+          <w:b/>
+          <w:bCs/>
+          <w:i/>
+          <w:iCs/>
+        </w:rPr>
+        <w:t>:  </w:t>
       </w:r>
     </w:p>
     <w:p>
@@ -214,7 +1263,27 @@
           <w:i/>
           <w:iCs/>
         </w:rPr>
-        <w:t>    Para criar uma nova pessoa, use</w:t>
+        <w:t xml:space="preserve">    Para </w:t>
+      </w:r>
+      <w:proofErr w:type="gramStart"/>
+      <w:r>
+        <w:rPr>
+          <w:b/>
+          <w:bCs/>
+          <w:i/>
+          <w:iCs/>
+        </w:rPr>
+        <w:t>criar uma nova</w:t>
+      </w:r>
+      <w:proofErr w:type="gramEnd"/>
+      <w:r>
+        <w:rPr>
+          <w:b/>
+          <w:bCs/>
+          <w:i/>
+          <w:iCs/>
+        </w:rPr>
+        <w:t xml:space="preserve"> pessoa, use</w:t>
       </w:r>
     </w:p>
     <w:p>
@@ -234,7 +1303,27 @@
           <w:i/>
           <w:iCs/>
         </w:rPr>
-        <w:t>    variavel = Gafanhoto (nome, idade)</w:t>
+        <w:t xml:space="preserve">    </w:t>
+      </w:r>
+      <w:proofErr w:type="spellStart"/>
+      <w:r>
+        <w:rPr>
+          <w:b/>
+          <w:bCs/>
+          <w:i/>
+          <w:iCs/>
+        </w:rPr>
+        <w:t>variavel</w:t>
+      </w:r>
+      <w:proofErr w:type="spellEnd"/>
+      <w:r>
+        <w:rPr>
+          <w:b/>
+          <w:bCs/>
+          <w:i/>
+          <w:iCs/>
+        </w:rPr>
+        <w:t xml:space="preserve"> = Gafanhoto (nome, idade)</w:t>
       </w:r>
     </w:p>
     <w:p>
@@ -274,13 +1363,41 @@
           <w:i/>
           <w:iCs/>
         </w:rPr>
-        <w:t>print(g1.__doc__)</w:t>
+        <w:t>print(g</w:t>
+      </w:r>
+      <w:proofErr w:type="gramStart"/>
+      <w:r>
+        <w:rPr>
+          <w:b/>
+          <w:bCs/>
+          <w:i/>
+          <w:iCs/>
+        </w:rPr>
+        <w:t>1._</w:t>
+      </w:r>
+      <w:proofErr w:type="gramEnd"/>
+      <w:r>
+        <w:rPr>
+          <w:b/>
+          <w:bCs/>
+          <w:i/>
+          <w:iCs/>
+        </w:rPr>
+        <w:t>_doc__)</w:t>
       </w:r>
     </w:p>
     <w:p/>
     <w:p>
       <w:r>
-        <w:t xml:space="preserve">__doc__ = </w:t>
+        <w:t>__</w:t>
+      </w:r>
+      <w:proofErr w:type="spellStart"/>
+      <w:r>
+        <w:t>doc</w:t>
+      </w:r>
+      <w:proofErr w:type="spellEnd"/>
+      <w:r>
+        <w:t xml:space="preserve">__ = </w:t>
       </w:r>
       <w:r>
         <w:t>Mostra a documentação de um atributo</w:t>
@@ -291,15 +1408,39 @@
     </w:p>
     <w:p>
       <w:r>
-        <w:t xml:space="preserve">__str__ = </w:t>
-      </w:r>
-      <w:r>
-        <w:t>Define uma string legível ao printar um objeto.</w:t>
-      </w:r>
-    </w:p>
-    <w:p>
-      <w:r>
-        <w:t xml:space="preserve">__dict__ = Mostra </w:t>
+        <w:t>__</w:t>
+      </w:r>
+      <w:proofErr w:type="spellStart"/>
+      <w:r>
+        <w:t>str</w:t>
+      </w:r>
+      <w:proofErr w:type="spellEnd"/>
+      <w:r>
+        <w:t xml:space="preserve">__ = </w:t>
+      </w:r>
+      <w:r>
+        <w:t xml:space="preserve">Define uma </w:t>
+      </w:r>
+      <w:proofErr w:type="spellStart"/>
+      <w:r>
+        <w:t>string</w:t>
+      </w:r>
+      <w:proofErr w:type="spellEnd"/>
+      <w:r>
+        <w:t xml:space="preserve"> legível ao printar um objeto.</w:t>
+      </w:r>
+    </w:p>
+    <w:p>
+      <w:r>
+        <w:t>__</w:t>
+      </w:r>
+      <w:proofErr w:type="spellStart"/>
+      <w:r>
+        <w:t>dict</w:t>
+      </w:r>
+      <w:proofErr w:type="spellEnd"/>
+      <w:r>
+        <w:t xml:space="preserve">__ = Mostra </w:t>
       </w:r>
       <w:r>
         <w:t>o objeto como um dicionário.</w:t>
@@ -307,7 +1448,23 @@
     </w:p>
     <w:p>
       <w:r>
-        <w:t xml:space="preserve">__getstate__() = </w:t>
+        <w:t>__</w:t>
+      </w:r>
+      <w:proofErr w:type="spellStart"/>
+      <w:r>
+        <w:t>getstate</w:t>
+      </w:r>
+      <w:proofErr w:type="spellEnd"/>
+      <w:r>
+        <w:t>_</w:t>
+      </w:r>
+      <w:proofErr w:type="gramStart"/>
+      <w:r>
+        <w:t>_(</w:t>
+      </w:r>
+      <w:proofErr w:type="gramEnd"/>
+      <w:r>
+        <w:t xml:space="preserve">) = </w:t>
       </w:r>
       <w:r>
         <w:t>Também</w:t>
@@ -321,7 +1478,19 @@
     </w:p>
     <w:p>
       <w:r>
-        <w:t>__class__ =</w:t>
+        <w:t>__</w:t>
+      </w:r>
+      <w:proofErr w:type="spellStart"/>
+      <w:r>
+        <w:t>class</w:t>
+      </w:r>
+      <w:proofErr w:type="spellEnd"/>
+      <w:r>
+        <w:t xml:space="preserve">__ </w:t>
+      </w:r>
+      <w:proofErr w:type="gramStart"/>
+      <w:r>
+        <w:t>=</w:t>
       </w:r>
       <w:r>
         <w:t xml:space="preserve"> </w:t>
@@ -333,7 +1502,11 @@
         <w:t>M</w:t>
       </w:r>
       <w:r>
-        <w:t>ostra  a classe a qual o objeto pertence.</w:t>
+        <w:t>ostra</w:t>
+      </w:r>
+      <w:proofErr w:type="gramEnd"/>
+      <w:r>
+        <w:t xml:space="preserve">  a classe a qual o objeto pertence.</w:t>
       </w:r>
     </w:p>
     <w:p>
@@ -382,7 +1555,6 @@
           <w:sz w:val="36"/>
           <w:szCs w:val="36"/>
         </w:rPr>
-        <w:lastRenderedPageBreak/>
         <w:t>AULA EXTRA – Biblioteca Rich</w:t>
       </w:r>
     </w:p>
@@ -413,14 +1585,30 @@
           <w:b/>
           <w:bCs/>
         </w:rPr>
-        <w:t>Para instalar</w:t>
-      </w:r>
-      <w:r>
-        <w:rPr>
-          <w:b/>
-          <w:bCs/>
-        </w:rPr>
-        <w:t xml:space="preserve"> : </w:t>
+        <w:t xml:space="preserve">Para </w:t>
+      </w:r>
+      <w:proofErr w:type="gramStart"/>
+      <w:r>
+        <w:rPr>
+          <w:b/>
+          <w:bCs/>
+        </w:rPr>
+        <w:t>instalar</w:t>
+      </w:r>
+      <w:r>
+        <w:rPr>
+          <w:b/>
+          <w:bCs/>
+        </w:rPr>
+        <w:t xml:space="preserve"> :</w:t>
+      </w:r>
+      <w:proofErr w:type="gramEnd"/>
+      <w:r>
+        <w:rPr>
+          <w:b/>
+          <w:bCs/>
+        </w:rPr>
+        <w:t xml:space="preserve"> </w:t>
       </w:r>
     </w:p>
     <w:p>
@@ -436,8 +1624,51 @@
           <w:b/>
           <w:bCs/>
         </w:rPr>
-        <w:t>- pip install rich</w:t>
-      </w:r>
+        <w:t xml:space="preserve">- </w:t>
+      </w:r>
+      <w:proofErr w:type="spellStart"/>
+      <w:proofErr w:type="gramStart"/>
+      <w:r>
+        <w:rPr>
+          <w:b/>
+          <w:bCs/>
+        </w:rPr>
+        <w:t>pip</w:t>
+      </w:r>
+      <w:proofErr w:type="spellEnd"/>
+      <w:proofErr w:type="gramEnd"/>
+      <w:r>
+        <w:rPr>
+          <w:b/>
+          <w:bCs/>
+        </w:rPr>
+        <w:t xml:space="preserve"> </w:t>
+      </w:r>
+      <w:proofErr w:type="spellStart"/>
+      <w:r>
+        <w:rPr>
+          <w:b/>
+          <w:bCs/>
+        </w:rPr>
+        <w:t>install</w:t>
+      </w:r>
+      <w:proofErr w:type="spellEnd"/>
+      <w:r>
+        <w:rPr>
+          <w:b/>
+          <w:bCs/>
+        </w:rPr>
+        <w:t xml:space="preserve"> </w:t>
+      </w:r>
+      <w:proofErr w:type="spellStart"/>
+      <w:r>
+        <w:rPr>
+          <w:b/>
+          <w:bCs/>
+        </w:rPr>
+        <w:t>rich</w:t>
+      </w:r>
+      <w:proofErr w:type="spellEnd"/>
     </w:p>
     <w:p>
       <w:pPr>
@@ -498,7 +1729,50 @@
           <w:bCs/>
         </w:rPr>
         <w:tab/>
-        <w:t xml:space="preserve">- python -m rich.emoji </w:t>
+        <w:t xml:space="preserve">- </w:t>
+      </w:r>
+      <w:proofErr w:type="spellStart"/>
+      <w:proofErr w:type="gramStart"/>
+      <w:r>
+        <w:rPr>
+          <w:b/>
+          <w:bCs/>
+        </w:rPr>
+        <w:t>python</w:t>
+      </w:r>
+      <w:proofErr w:type="spellEnd"/>
+      <w:r>
+        <w:rPr>
+          <w:b/>
+          <w:bCs/>
+        </w:rPr>
+        <w:t xml:space="preserve"> -m</w:t>
+      </w:r>
+      <w:proofErr w:type="gramEnd"/>
+      <w:r>
+        <w:rPr>
+          <w:b/>
+          <w:bCs/>
+        </w:rPr>
+        <w:t xml:space="preserve"> </w:t>
+      </w:r>
+      <w:proofErr w:type="spellStart"/>
+      <w:proofErr w:type="gramStart"/>
+      <w:r>
+        <w:rPr>
+          <w:b/>
+          <w:bCs/>
+        </w:rPr>
+        <w:t>rich.emoji</w:t>
+      </w:r>
+      <w:proofErr w:type="spellEnd"/>
+      <w:proofErr w:type="gramEnd"/>
+      <w:r>
+        <w:rPr>
+          <w:b/>
+          <w:bCs/>
+        </w:rPr>
+        <w:t xml:space="preserve"> </w:t>
       </w:r>
     </w:p>
     <w:sectPr>
@@ -509,6 +1783,588 @@
     </w:sectPr>
   </w:body>
 </w:document>
+</file>
+
+<file path=word/numbering.xml><?xml version="1.0" encoding="utf-8"?>
+<w:numbering xmlns:wpc="http://schemas.microsoft.com/office/word/2010/wordprocessingCanvas" xmlns:cx="http://schemas.microsoft.com/office/drawing/2014/chartex" xmlns:cx1="http://schemas.microsoft.com/office/drawing/2015/9/8/chartex" xmlns:cx2="http://schemas.microsoft.com/office/drawing/2015/10/21/chartex" xmlns:cx3="http://schemas.microsoft.com/office/drawing/2016/5/9/chartex" xmlns:cx4="http://schemas.microsoft.com/office/drawing/2016/5/10/chartex" xmlns:cx5="http://schemas.microsoft.com/office/drawing/2016/5/11/chartex" xmlns:cx6="http://schemas.microsoft.com/office/drawing/2016/5/12/chartex" xmlns:cx7="http://schemas.microsoft.com/office/drawing/2016/5/13/chartex" xmlns:cx8="http://schemas.microsoft.com/office/drawing/2016/5/14/chartex" xmlns:mc="http://schemas.openxmlformats.org/markup-compatibility/2006" xmlns:aink="http://schemas.microsoft.com/office/drawing/2016/ink" xmlns:am3d="http://schemas.microsoft.com/office/drawing/2017/model3d" xmlns:o="urn:schemas-microsoft-com:office:office" xmlns:oel="http://schemas.microsoft.com/office/2019/extlst" xmlns:r="http://schemas.openxmlformats.org/officeDocument/2006/relationships" xmlns:m="http://schemas.openxmlformats.org/officeDocument/2006/math" xmlns:v="urn:schemas-microsoft-com:vml" xmlns:wp14="http://schemas.microsoft.com/office/word/2010/wordprocessingDrawing" xmlns:wp="http://schemas.openxmlformats.org/drawingml/2006/wordprocessingDrawing" xmlns:w10="urn:schemas-microsoft-com:office:word" xmlns:w="http://schemas.openxmlformats.org/wordprocessingml/2006/main" xmlns:w14="http://schemas.microsoft.com/office/word/2010/wordml" xmlns:w15="http://schemas.microsoft.com/office/word/2012/wordml" xmlns:w16cex="http://schemas.microsoft.com/office/word/2018/wordml/cex" xmlns:w16cid="http://schemas.microsoft.com/office/word/2016/wordml/cid" xmlns:w16="http://schemas.microsoft.com/office/word/2018/wordml" xmlns:w16du="http://schemas.microsoft.com/office/word/2023/wordml/word16du" xmlns:w16sdtdh="http://schemas.microsoft.com/office/word/2020/wordml/sdtdatahash" xmlns:w16sdtfl="http://schemas.microsoft.com/office/word/2024/wordml/sdtformatlock" xmlns:w16se="http://schemas.microsoft.com/office/word/2015/wordml/symex" xmlns:wpg="http://schemas.microsoft.com/office/word/2010/wordprocessingGroup" xmlns:wpi="http://schemas.microsoft.com/office/word/2010/wordprocessingInk" xmlns:wne="http://schemas.microsoft.com/office/word/2006/wordml" xmlns:wps="http://schemas.microsoft.com/office/word/2010/wordprocessingShape" mc:Ignorable="w14 w15 w16se w16cid w16 w16cex w16sdtdh w16sdtfl w16du wp14">
+  <w:abstractNum w:abstractNumId="0" w15:restartNumberingAfterBreak="0">
+    <w:nsid w:val="1B400F74"/>
+    <w:multiLevelType w:val="hybridMultilevel"/>
+    <w:tmpl w:val="876468B2"/>
+    <w:lvl w:ilvl="0" w:tplc="04160005">
+      <w:start w:val="1"/>
+      <w:numFmt w:val="bullet"/>
+      <w:lvlText w:val=""/>
+      <w:lvlJc w:val="left"/>
+      <w:pPr>
+        <w:ind w:left="720" w:hanging="360"/>
+      </w:pPr>
+      <w:rPr>
+        <w:rFonts w:ascii="Wingdings" w:hAnsi="Wingdings" w:hint="default"/>
+      </w:rPr>
+    </w:lvl>
+    <w:lvl w:ilvl="1" w:tplc="04160003" w:tentative="1">
+      <w:start w:val="1"/>
+      <w:numFmt w:val="bullet"/>
+      <w:lvlText w:val="o"/>
+      <w:lvlJc w:val="left"/>
+      <w:pPr>
+        <w:ind w:left="1440" w:hanging="360"/>
+      </w:pPr>
+      <w:rPr>
+        <w:rFonts w:ascii="Courier New" w:hAnsi="Courier New" w:cs="Courier New" w:hint="default"/>
+      </w:rPr>
+    </w:lvl>
+    <w:lvl w:ilvl="2" w:tplc="04160005" w:tentative="1">
+      <w:start w:val="1"/>
+      <w:numFmt w:val="bullet"/>
+      <w:lvlText w:val=""/>
+      <w:lvlJc w:val="left"/>
+      <w:pPr>
+        <w:ind w:left="2160" w:hanging="360"/>
+      </w:pPr>
+      <w:rPr>
+        <w:rFonts w:ascii="Wingdings" w:hAnsi="Wingdings" w:hint="default"/>
+      </w:rPr>
+    </w:lvl>
+    <w:lvl w:ilvl="3" w:tplc="04160001" w:tentative="1">
+      <w:start w:val="1"/>
+      <w:numFmt w:val="bullet"/>
+      <w:lvlText w:val=""/>
+      <w:lvlJc w:val="left"/>
+      <w:pPr>
+        <w:ind w:left="2880" w:hanging="360"/>
+      </w:pPr>
+      <w:rPr>
+        <w:rFonts w:ascii="Symbol" w:hAnsi="Symbol" w:hint="default"/>
+      </w:rPr>
+    </w:lvl>
+    <w:lvl w:ilvl="4" w:tplc="04160003" w:tentative="1">
+      <w:start w:val="1"/>
+      <w:numFmt w:val="bullet"/>
+      <w:lvlText w:val="o"/>
+      <w:lvlJc w:val="left"/>
+      <w:pPr>
+        <w:ind w:left="3600" w:hanging="360"/>
+      </w:pPr>
+      <w:rPr>
+        <w:rFonts w:ascii="Courier New" w:hAnsi="Courier New" w:cs="Courier New" w:hint="default"/>
+      </w:rPr>
+    </w:lvl>
+    <w:lvl w:ilvl="5" w:tplc="04160005" w:tentative="1">
+      <w:start w:val="1"/>
+      <w:numFmt w:val="bullet"/>
+      <w:lvlText w:val=""/>
+      <w:lvlJc w:val="left"/>
+      <w:pPr>
+        <w:ind w:left="4320" w:hanging="360"/>
+      </w:pPr>
+      <w:rPr>
+        <w:rFonts w:ascii="Wingdings" w:hAnsi="Wingdings" w:hint="default"/>
+      </w:rPr>
+    </w:lvl>
+    <w:lvl w:ilvl="6" w:tplc="04160001" w:tentative="1">
+      <w:start w:val="1"/>
+      <w:numFmt w:val="bullet"/>
+      <w:lvlText w:val=""/>
+      <w:lvlJc w:val="left"/>
+      <w:pPr>
+        <w:ind w:left="5040" w:hanging="360"/>
+      </w:pPr>
+      <w:rPr>
+        <w:rFonts w:ascii="Symbol" w:hAnsi="Symbol" w:hint="default"/>
+      </w:rPr>
+    </w:lvl>
+    <w:lvl w:ilvl="7" w:tplc="04160003" w:tentative="1">
+      <w:start w:val="1"/>
+      <w:numFmt w:val="bullet"/>
+      <w:lvlText w:val="o"/>
+      <w:lvlJc w:val="left"/>
+      <w:pPr>
+        <w:ind w:left="5760" w:hanging="360"/>
+      </w:pPr>
+      <w:rPr>
+        <w:rFonts w:ascii="Courier New" w:hAnsi="Courier New" w:cs="Courier New" w:hint="default"/>
+      </w:rPr>
+    </w:lvl>
+    <w:lvl w:ilvl="8" w:tplc="04160005" w:tentative="1">
+      <w:start w:val="1"/>
+      <w:numFmt w:val="bullet"/>
+      <w:lvlText w:val=""/>
+      <w:lvlJc w:val="left"/>
+      <w:pPr>
+        <w:ind w:left="6480" w:hanging="360"/>
+      </w:pPr>
+      <w:rPr>
+        <w:rFonts w:ascii="Wingdings" w:hAnsi="Wingdings" w:hint="default"/>
+      </w:rPr>
+    </w:lvl>
+  </w:abstractNum>
+  <w:abstractNum w:abstractNumId="1" w15:restartNumberingAfterBreak="0">
+    <w:nsid w:val="288E10D2"/>
+    <w:multiLevelType w:val="hybridMultilevel"/>
+    <w:tmpl w:val="FD6E05B6"/>
+    <w:lvl w:ilvl="0" w:tplc="19402006">
+      <w:numFmt w:val="bullet"/>
+      <w:lvlText w:val=""/>
+      <w:lvlJc w:val="left"/>
+      <w:pPr>
+        <w:ind w:left="3195" w:hanging="360"/>
+      </w:pPr>
+      <w:rPr>
+        <w:rFonts w:ascii="Wingdings" w:eastAsiaTheme="minorHAnsi" w:hAnsi="Wingdings" w:cstheme="minorBidi" w:hint="default"/>
+      </w:rPr>
+    </w:lvl>
+    <w:lvl w:ilvl="1" w:tplc="04160003" w:tentative="1">
+      <w:start w:val="1"/>
+      <w:numFmt w:val="bullet"/>
+      <w:lvlText w:val="o"/>
+      <w:lvlJc w:val="left"/>
+      <w:pPr>
+        <w:ind w:left="3915" w:hanging="360"/>
+      </w:pPr>
+      <w:rPr>
+        <w:rFonts w:ascii="Courier New" w:hAnsi="Courier New" w:cs="Courier New" w:hint="default"/>
+      </w:rPr>
+    </w:lvl>
+    <w:lvl w:ilvl="2" w:tplc="04160005" w:tentative="1">
+      <w:start w:val="1"/>
+      <w:numFmt w:val="bullet"/>
+      <w:lvlText w:val=""/>
+      <w:lvlJc w:val="left"/>
+      <w:pPr>
+        <w:ind w:left="4635" w:hanging="360"/>
+      </w:pPr>
+      <w:rPr>
+        <w:rFonts w:ascii="Wingdings" w:hAnsi="Wingdings" w:hint="default"/>
+      </w:rPr>
+    </w:lvl>
+    <w:lvl w:ilvl="3" w:tplc="04160001" w:tentative="1">
+      <w:start w:val="1"/>
+      <w:numFmt w:val="bullet"/>
+      <w:lvlText w:val=""/>
+      <w:lvlJc w:val="left"/>
+      <w:pPr>
+        <w:ind w:left="5355" w:hanging="360"/>
+      </w:pPr>
+      <w:rPr>
+        <w:rFonts w:ascii="Symbol" w:hAnsi="Symbol" w:hint="default"/>
+      </w:rPr>
+    </w:lvl>
+    <w:lvl w:ilvl="4" w:tplc="04160003" w:tentative="1">
+      <w:start w:val="1"/>
+      <w:numFmt w:val="bullet"/>
+      <w:lvlText w:val="o"/>
+      <w:lvlJc w:val="left"/>
+      <w:pPr>
+        <w:ind w:left="6075" w:hanging="360"/>
+      </w:pPr>
+      <w:rPr>
+        <w:rFonts w:ascii="Courier New" w:hAnsi="Courier New" w:cs="Courier New" w:hint="default"/>
+      </w:rPr>
+    </w:lvl>
+    <w:lvl w:ilvl="5" w:tplc="04160005" w:tentative="1">
+      <w:start w:val="1"/>
+      <w:numFmt w:val="bullet"/>
+      <w:lvlText w:val=""/>
+      <w:lvlJc w:val="left"/>
+      <w:pPr>
+        <w:ind w:left="6795" w:hanging="360"/>
+      </w:pPr>
+      <w:rPr>
+        <w:rFonts w:ascii="Wingdings" w:hAnsi="Wingdings" w:hint="default"/>
+      </w:rPr>
+    </w:lvl>
+    <w:lvl w:ilvl="6" w:tplc="04160001" w:tentative="1">
+      <w:start w:val="1"/>
+      <w:numFmt w:val="bullet"/>
+      <w:lvlText w:val=""/>
+      <w:lvlJc w:val="left"/>
+      <w:pPr>
+        <w:ind w:left="7515" w:hanging="360"/>
+      </w:pPr>
+      <w:rPr>
+        <w:rFonts w:ascii="Symbol" w:hAnsi="Symbol" w:hint="default"/>
+      </w:rPr>
+    </w:lvl>
+    <w:lvl w:ilvl="7" w:tplc="04160003" w:tentative="1">
+      <w:start w:val="1"/>
+      <w:numFmt w:val="bullet"/>
+      <w:lvlText w:val="o"/>
+      <w:lvlJc w:val="left"/>
+      <w:pPr>
+        <w:ind w:left="8235" w:hanging="360"/>
+      </w:pPr>
+      <w:rPr>
+        <w:rFonts w:ascii="Courier New" w:hAnsi="Courier New" w:cs="Courier New" w:hint="default"/>
+      </w:rPr>
+    </w:lvl>
+    <w:lvl w:ilvl="8" w:tplc="04160005" w:tentative="1">
+      <w:start w:val="1"/>
+      <w:numFmt w:val="bullet"/>
+      <w:lvlText w:val=""/>
+      <w:lvlJc w:val="left"/>
+      <w:pPr>
+        <w:ind w:left="8955" w:hanging="360"/>
+      </w:pPr>
+      <w:rPr>
+        <w:rFonts w:ascii="Wingdings" w:hAnsi="Wingdings" w:hint="default"/>
+      </w:rPr>
+    </w:lvl>
+  </w:abstractNum>
+  <w:abstractNum w:abstractNumId="2" w15:restartNumberingAfterBreak="0">
+    <w:nsid w:val="3A5E7146"/>
+    <w:multiLevelType w:val="hybridMultilevel"/>
+    <w:tmpl w:val="A782C8F6"/>
+    <w:lvl w:ilvl="0" w:tplc="0416000B">
+      <w:start w:val="1"/>
+      <w:numFmt w:val="bullet"/>
+      <w:lvlText w:val=""/>
+      <w:lvlJc w:val="left"/>
+      <w:pPr>
+        <w:ind w:left="720" w:hanging="360"/>
+      </w:pPr>
+      <w:rPr>
+        <w:rFonts w:ascii="Wingdings" w:hAnsi="Wingdings" w:hint="default"/>
+      </w:rPr>
+    </w:lvl>
+    <w:lvl w:ilvl="1" w:tplc="04160003" w:tentative="1">
+      <w:start w:val="1"/>
+      <w:numFmt w:val="bullet"/>
+      <w:lvlText w:val="o"/>
+      <w:lvlJc w:val="left"/>
+      <w:pPr>
+        <w:ind w:left="1440" w:hanging="360"/>
+      </w:pPr>
+      <w:rPr>
+        <w:rFonts w:ascii="Courier New" w:hAnsi="Courier New" w:cs="Courier New" w:hint="default"/>
+      </w:rPr>
+    </w:lvl>
+    <w:lvl w:ilvl="2" w:tplc="04160005" w:tentative="1">
+      <w:start w:val="1"/>
+      <w:numFmt w:val="bullet"/>
+      <w:lvlText w:val=""/>
+      <w:lvlJc w:val="left"/>
+      <w:pPr>
+        <w:ind w:left="2160" w:hanging="360"/>
+      </w:pPr>
+      <w:rPr>
+        <w:rFonts w:ascii="Wingdings" w:hAnsi="Wingdings" w:hint="default"/>
+      </w:rPr>
+    </w:lvl>
+    <w:lvl w:ilvl="3" w:tplc="04160001" w:tentative="1">
+      <w:start w:val="1"/>
+      <w:numFmt w:val="bullet"/>
+      <w:lvlText w:val=""/>
+      <w:lvlJc w:val="left"/>
+      <w:pPr>
+        <w:ind w:left="2880" w:hanging="360"/>
+      </w:pPr>
+      <w:rPr>
+        <w:rFonts w:ascii="Symbol" w:hAnsi="Symbol" w:hint="default"/>
+      </w:rPr>
+    </w:lvl>
+    <w:lvl w:ilvl="4" w:tplc="04160003" w:tentative="1">
+      <w:start w:val="1"/>
+      <w:numFmt w:val="bullet"/>
+      <w:lvlText w:val="o"/>
+      <w:lvlJc w:val="left"/>
+      <w:pPr>
+        <w:ind w:left="3600" w:hanging="360"/>
+      </w:pPr>
+      <w:rPr>
+        <w:rFonts w:ascii="Courier New" w:hAnsi="Courier New" w:cs="Courier New" w:hint="default"/>
+      </w:rPr>
+    </w:lvl>
+    <w:lvl w:ilvl="5" w:tplc="04160005" w:tentative="1">
+      <w:start w:val="1"/>
+      <w:numFmt w:val="bullet"/>
+      <w:lvlText w:val=""/>
+      <w:lvlJc w:val="left"/>
+      <w:pPr>
+        <w:ind w:left="4320" w:hanging="360"/>
+      </w:pPr>
+      <w:rPr>
+        <w:rFonts w:ascii="Wingdings" w:hAnsi="Wingdings" w:hint="default"/>
+      </w:rPr>
+    </w:lvl>
+    <w:lvl w:ilvl="6" w:tplc="04160001" w:tentative="1">
+      <w:start w:val="1"/>
+      <w:numFmt w:val="bullet"/>
+      <w:lvlText w:val=""/>
+      <w:lvlJc w:val="left"/>
+      <w:pPr>
+        <w:ind w:left="5040" w:hanging="360"/>
+      </w:pPr>
+      <w:rPr>
+        <w:rFonts w:ascii="Symbol" w:hAnsi="Symbol" w:hint="default"/>
+      </w:rPr>
+    </w:lvl>
+    <w:lvl w:ilvl="7" w:tplc="04160003" w:tentative="1">
+      <w:start w:val="1"/>
+      <w:numFmt w:val="bullet"/>
+      <w:lvlText w:val="o"/>
+      <w:lvlJc w:val="left"/>
+      <w:pPr>
+        <w:ind w:left="5760" w:hanging="360"/>
+      </w:pPr>
+      <w:rPr>
+        <w:rFonts w:ascii="Courier New" w:hAnsi="Courier New" w:cs="Courier New" w:hint="default"/>
+      </w:rPr>
+    </w:lvl>
+    <w:lvl w:ilvl="8" w:tplc="04160005" w:tentative="1">
+      <w:start w:val="1"/>
+      <w:numFmt w:val="bullet"/>
+      <w:lvlText w:val=""/>
+      <w:lvlJc w:val="left"/>
+      <w:pPr>
+        <w:ind w:left="6480" w:hanging="360"/>
+      </w:pPr>
+      <w:rPr>
+        <w:rFonts w:ascii="Wingdings" w:hAnsi="Wingdings" w:hint="default"/>
+      </w:rPr>
+    </w:lvl>
+  </w:abstractNum>
+  <w:abstractNum w:abstractNumId="3" w15:restartNumberingAfterBreak="0">
+    <w:nsid w:val="49020798"/>
+    <w:multiLevelType w:val="hybridMultilevel"/>
+    <w:tmpl w:val="05E6B040"/>
+    <w:lvl w:ilvl="0" w:tplc="B3D8D410">
+      <w:numFmt w:val="bullet"/>
+      <w:lvlText w:val=""/>
+      <w:lvlJc w:val="left"/>
+      <w:pPr>
+        <w:ind w:left="1068" w:hanging="360"/>
+      </w:pPr>
+      <w:rPr>
+        <w:rFonts w:ascii="Wingdings" w:eastAsiaTheme="minorHAnsi" w:hAnsi="Wingdings" w:cstheme="minorBidi" w:hint="default"/>
+      </w:rPr>
+    </w:lvl>
+    <w:lvl w:ilvl="1" w:tplc="04160003" w:tentative="1">
+      <w:start w:val="1"/>
+      <w:numFmt w:val="bullet"/>
+      <w:lvlText w:val="o"/>
+      <w:lvlJc w:val="left"/>
+      <w:pPr>
+        <w:ind w:left="1788" w:hanging="360"/>
+      </w:pPr>
+      <w:rPr>
+        <w:rFonts w:ascii="Courier New" w:hAnsi="Courier New" w:cs="Courier New" w:hint="default"/>
+      </w:rPr>
+    </w:lvl>
+    <w:lvl w:ilvl="2" w:tplc="04160005" w:tentative="1">
+      <w:start w:val="1"/>
+      <w:numFmt w:val="bullet"/>
+      <w:lvlText w:val=""/>
+      <w:lvlJc w:val="left"/>
+      <w:pPr>
+        <w:ind w:left="2508" w:hanging="360"/>
+      </w:pPr>
+      <w:rPr>
+        <w:rFonts w:ascii="Wingdings" w:hAnsi="Wingdings" w:hint="default"/>
+      </w:rPr>
+    </w:lvl>
+    <w:lvl w:ilvl="3" w:tplc="04160001" w:tentative="1">
+      <w:start w:val="1"/>
+      <w:numFmt w:val="bullet"/>
+      <w:lvlText w:val=""/>
+      <w:lvlJc w:val="left"/>
+      <w:pPr>
+        <w:ind w:left="3228" w:hanging="360"/>
+      </w:pPr>
+      <w:rPr>
+        <w:rFonts w:ascii="Symbol" w:hAnsi="Symbol" w:hint="default"/>
+      </w:rPr>
+    </w:lvl>
+    <w:lvl w:ilvl="4" w:tplc="04160003" w:tentative="1">
+      <w:start w:val="1"/>
+      <w:numFmt w:val="bullet"/>
+      <w:lvlText w:val="o"/>
+      <w:lvlJc w:val="left"/>
+      <w:pPr>
+        <w:ind w:left="3948" w:hanging="360"/>
+      </w:pPr>
+      <w:rPr>
+        <w:rFonts w:ascii="Courier New" w:hAnsi="Courier New" w:cs="Courier New" w:hint="default"/>
+      </w:rPr>
+    </w:lvl>
+    <w:lvl w:ilvl="5" w:tplc="04160005" w:tentative="1">
+      <w:start w:val="1"/>
+      <w:numFmt w:val="bullet"/>
+      <w:lvlText w:val=""/>
+      <w:lvlJc w:val="left"/>
+      <w:pPr>
+        <w:ind w:left="4668" w:hanging="360"/>
+      </w:pPr>
+      <w:rPr>
+        <w:rFonts w:ascii="Wingdings" w:hAnsi="Wingdings" w:hint="default"/>
+      </w:rPr>
+    </w:lvl>
+    <w:lvl w:ilvl="6" w:tplc="04160001" w:tentative="1">
+      <w:start w:val="1"/>
+      <w:numFmt w:val="bullet"/>
+      <w:lvlText w:val=""/>
+      <w:lvlJc w:val="left"/>
+      <w:pPr>
+        <w:ind w:left="5388" w:hanging="360"/>
+      </w:pPr>
+      <w:rPr>
+        <w:rFonts w:ascii="Symbol" w:hAnsi="Symbol" w:hint="default"/>
+      </w:rPr>
+    </w:lvl>
+    <w:lvl w:ilvl="7" w:tplc="04160003" w:tentative="1">
+      <w:start w:val="1"/>
+      <w:numFmt w:val="bullet"/>
+      <w:lvlText w:val="o"/>
+      <w:lvlJc w:val="left"/>
+      <w:pPr>
+        <w:ind w:left="6108" w:hanging="360"/>
+      </w:pPr>
+      <w:rPr>
+        <w:rFonts w:ascii="Courier New" w:hAnsi="Courier New" w:cs="Courier New" w:hint="default"/>
+      </w:rPr>
+    </w:lvl>
+    <w:lvl w:ilvl="8" w:tplc="04160005" w:tentative="1">
+      <w:start w:val="1"/>
+      <w:numFmt w:val="bullet"/>
+      <w:lvlText w:val=""/>
+      <w:lvlJc w:val="left"/>
+      <w:pPr>
+        <w:ind w:left="6828" w:hanging="360"/>
+      </w:pPr>
+      <w:rPr>
+        <w:rFonts w:ascii="Wingdings" w:hAnsi="Wingdings" w:hint="default"/>
+      </w:rPr>
+    </w:lvl>
+  </w:abstractNum>
+  <w:abstractNum w:abstractNumId="4" w15:restartNumberingAfterBreak="0">
+    <w:nsid w:val="4CE06CD6"/>
+    <w:multiLevelType w:val="hybridMultilevel"/>
+    <w:tmpl w:val="4FCA623E"/>
+    <w:lvl w:ilvl="0" w:tplc="43E8937A">
+      <w:numFmt w:val="bullet"/>
+      <w:lvlText w:val=""/>
+      <w:lvlJc w:val="left"/>
+      <w:pPr>
+        <w:ind w:left="1068" w:hanging="360"/>
+      </w:pPr>
+      <w:rPr>
+        <w:rFonts w:ascii="Wingdings" w:eastAsiaTheme="minorHAnsi" w:hAnsi="Wingdings" w:cstheme="minorBidi" w:hint="default"/>
+      </w:rPr>
+    </w:lvl>
+    <w:lvl w:ilvl="1" w:tplc="04160003" w:tentative="1">
+      <w:start w:val="1"/>
+      <w:numFmt w:val="bullet"/>
+      <w:lvlText w:val="o"/>
+      <w:lvlJc w:val="left"/>
+      <w:pPr>
+        <w:ind w:left="1788" w:hanging="360"/>
+      </w:pPr>
+      <w:rPr>
+        <w:rFonts w:ascii="Courier New" w:hAnsi="Courier New" w:cs="Courier New" w:hint="default"/>
+      </w:rPr>
+    </w:lvl>
+    <w:lvl w:ilvl="2" w:tplc="04160005" w:tentative="1">
+      <w:start w:val="1"/>
+      <w:numFmt w:val="bullet"/>
+      <w:lvlText w:val=""/>
+      <w:lvlJc w:val="left"/>
+      <w:pPr>
+        <w:ind w:left="2508" w:hanging="360"/>
+      </w:pPr>
+      <w:rPr>
+        <w:rFonts w:ascii="Wingdings" w:hAnsi="Wingdings" w:hint="default"/>
+      </w:rPr>
+    </w:lvl>
+    <w:lvl w:ilvl="3" w:tplc="04160001" w:tentative="1">
+      <w:start w:val="1"/>
+      <w:numFmt w:val="bullet"/>
+      <w:lvlText w:val=""/>
+      <w:lvlJc w:val="left"/>
+      <w:pPr>
+        <w:ind w:left="3228" w:hanging="360"/>
+      </w:pPr>
+      <w:rPr>
+        <w:rFonts w:ascii="Symbol" w:hAnsi="Symbol" w:hint="default"/>
+      </w:rPr>
+    </w:lvl>
+    <w:lvl w:ilvl="4" w:tplc="04160003" w:tentative="1">
+      <w:start w:val="1"/>
+      <w:numFmt w:val="bullet"/>
+      <w:lvlText w:val="o"/>
+      <w:lvlJc w:val="left"/>
+      <w:pPr>
+        <w:ind w:left="3948" w:hanging="360"/>
+      </w:pPr>
+      <w:rPr>
+        <w:rFonts w:ascii="Courier New" w:hAnsi="Courier New" w:cs="Courier New" w:hint="default"/>
+      </w:rPr>
+    </w:lvl>
+    <w:lvl w:ilvl="5" w:tplc="04160005" w:tentative="1">
+      <w:start w:val="1"/>
+      <w:numFmt w:val="bullet"/>
+      <w:lvlText w:val=""/>
+      <w:lvlJc w:val="left"/>
+      <w:pPr>
+        <w:ind w:left="4668" w:hanging="360"/>
+      </w:pPr>
+      <w:rPr>
+        <w:rFonts w:ascii="Wingdings" w:hAnsi="Wingdings" w:hint="default"/>
+      </w:rPr>
+    </w:lvl>
+    <w:lvl w:ilvl="6" w:tplc="04160001" w:tentative="1">
+      <w:start w:val="1"/>
+      <w:numFmt w:val="bullet"/>
+      <w:lvlText w:val=""/>
+      <w:lvlJc w:val="left"/>
+      <w:pPr>
+        <w:ind w:left="5388" w:hanging="360"/>
+      </w:pPr>
+      <w:rPr>
+        <w:rFonts w:ascii="Symbol" w:hAnsi="Symbol" w:hint="default"/>
+      </w:rPr>
+    </w:lvl>
+    <w:lvl w:ilvl="7" w:tplc="04160003" w:tentative="1">
+      <w:start w:val="1"/>
+      <w:numFmt w:val="bullet"/>
+      <w:lvlText w:val="o"/>
+      <w:lvlJc w:val="left"/>
+      <w:pPr>
+        <w:ind w:left="6108" w:hanging="360"/>
+      </w:pPr>
+      <w:rPr>
+        <w:rFonts w:ascii="Courier New" w:hAnsi="Courier New" w:cs="Courier New" w:hint="default"/>
+      </w:rPr>
+    </w:lvl>
+    <w:lvl w:ilvl="8" w:tplc="04160005" w:tentative="1">
+      <w:start w:val="1"/>
+      <w:numFmt w:val="bullet"/>
+      <w:lvlText w:val=""/>
+      <w:lvlJc w:val="left"/>
+      <w:pPr>
+        <w:ind w:left="6828" w:hanging="360"/>
+      </w:pPr>
+      <w:rPr>
+        <w:rFonts w:ascii="Wingdings" w:hAnsi="Wingdings" w:hint="default"/>
+      </w:rPr>
+    </w:lvl>
+  </w:abstractNum>
+  <w:num w:numId="1" w16cid:durableId="1046180861">
+    <w:abstractNumId w:val="1"/>
+  </w:num>
+  <w:num w:numId="2" w16cid:durableId="641934587">
+    <w:abstractNumId w:val="3"/>
+  </w:num>
+  <w:num w:numId="3" w16cid:durableId="1933005059">
+    <w:abstractNumId w:val="4"/>
+  </w:num>
+  <w:num w:numId="4" w16cid:durableId="46687232">
+    <w:abstractNumId w:val="0"/>
+  </w:num>
+  <w:num w:numId="5" w16cid:durableId="1374041265">
+    <w:abstractNumId w:val="2"/>
+  </w:num>
+</w:numbering>
 </file>
 
 <file path=word/styles.xml><?xml version="1.0" encoding="utf-8"?>
@@ -1114,7 +2970,6 @@
   <w:style w:type="character" w:default="1" w:styleId="Fontepargpadro">
     <w:name w:val="Default Paragraph Font"/>
     <w:uiPriority w:val="1"/>
-    <w:semiHidden/>
     <w:unhideWhenUsed/>
   </w:style>
   <w:style w:type="table" w:default="1" w:styleId="Tabelanormal">

</xml_diff>

<commit_message>
Aula e Exercício de Herança
</commit_message>
<xml_diff>
--- a/POO_pytho/POO-CursoEmVideo/Notas Python.docx
+++ b/POO_pytho/POO-CursoEmVideo/Notas Python.docx
@@ -79,10 +79,7 @@
         <w:t xml:space="preserve">s </w:t>
       </w:r>
       <w:r>
-        <w:t>t</w:t>
-      </w:r>
-      <w:r>
-        <w:t>uplas</w:t>
+        <w:t>tuplas</w:t>
       </w:r>
       <w:r>
         <w:t xml:space="preserve"> quando criadas</w:t>
@@ -363,10 +360,7 @@
         <w:t xml:space="preserve"> : </w:t>
       </w:r>
       <w:r>
-        <w:t>é usado para determinar o comprimento de uma tupla, retorna o tamanho da tupla/lista</w:t>
-      </w:r>
-      <w:r>
-        <w:t>.</w:t>
+        <w:t>é usado para determinar o comprimento de uma tupla, retorna o tamanho da tupla/lista.</w:t>
       </w:r>
     </w:p>
     <w:p>
@@ -744,14 +738,7 @@
           <w:b/>
           <w:bCs/>
         </w:rPr>
-        <w:t xml:space="preserve">, </w:t>
-      </w:r>
-      <w:r>
-        <w:rPr>
-          <w:b/>
-          <w:bCs/>
-        </w:rPr>
-        <w:t>c</w:t>
+        <w:t>, c</w:t>
       </w:r>
       <w:r>
         <w:t xml:space="preserve"> in </w:t>
@@ -836,7 +823,6 @@
     <w:p/>
     <w:p/>
     <w:p/>
-    <w:p/>
     <w:p>
       <w:pPr>
         <w:rPr>
@@ -856,33 +842,15 @@
           <w:szCs w:val="40"/>
         </w:rPr>
       </w:pPr>
-    </w:p>
-    <w:p>
-      <w:pPr>
+      <w:r>
         <w:rPr>
           <w:b/>
           <w:bCs/>
           <w:sz w:val="40"/>
           <w:szCs w:val="40"/>
         </w:rPr>
-      </w:pPr>
-      <w:r>
-        <w:rPr>
-          <w:b/>
-          <w:bCs/>
-          <w:sz w:val="40"/>
-          <w:szCs w:val="40"/>
-        </w:rPr>
-        <w:t xml:space="preserve">Python | </w:t>
-      </w:r>
-      <w:r>
-        <w:rPr>
-          <w:b/>
-          <w:bCs/>
-          <w:sz w:val="40"/>
-          <w:szCs w:val="40"/>
-        </w:rPr>
-        <w:t>Programação Orientada a Objetos</w:t>
+        <w:lastRenderedPageBreak/>
+        <w:t>Python | Programação Orientada a Objetos</w:t>
       </w:r>
     </w:p>
     <w:p>
@@ -1775,6 +1743,433 @@
         <w:t xml:space="preserve"> </w:t>
       </w:r>
     </w:p>
+    <w:p>
+      <w:pPr>
+        <w:rPr>
+          <w:b/>
+          <w:bCs/>
+        </w:rPr>
+      </w:pPr>
+    </w:p>
+    <w:p>
+      <w:pPr>
+        <w:rPr>
+          <w:b/>
+          <w:bCs/>
+          <w:sz w:val="40"/>
+          <w:szCs w:val="40"/>
+        </w:rPr>
+      </w:pPr>
+      <w:r>
+        <w:rPr>
+          <w:b/>
+          <w:bCs/>
+          <w:sz w:val="40"/>
+          <w:szCs w:val="40"/>
+        </w:rPr>
+        <w:t xml:space="preserve">AULA </w:t>
+      </w:r>
+      <w:r>
+        <w:rPr>
+          <w:b/>
+          <w:bCs/>
+          <w:sz w:val="40"/>
+          <w:szCs w:val="40"/>
+        </w:rPr>
+        <w:t>7</w:t>
+      </w:r>
+      <w:r>
+        <w:rPr>
+          <w:b/>
+          <w:bCs/>
+          <w:sz w:val="40"/>
+          <w:szCs w:val="40"/>
+        </w:rPr>
+        <w:t xml:space="preserve"> – </w:t>
+      </w:r>
+      <w:r>
+        <w:rPr>
+          <w:b/>
+          <w:bCs/>
+          <w:sz w:val="40"/>
+          <w:szCs w:val="40"/>
+        </w:rPr>
+        <w:t>Herança em Python</w:t>
+      </w:r>
+    </w:p>
+    <w:p>
+      <w:pPr>
+        <w:rPr>
+          <w:b/>
+          <w:bCs/>
+          <w:sz w:val="40"/>
+          <w:szCs w:val="40"/>
+        </w:rPr>
+      </w:pPr>
+    </w:p>
+    <w:p>
+      <w:pPr>
+        <w:rPr>
+          <w:b/>
+          <w:bCs/>
+          <w:sz w:val="36"/>
+          <w:szCs w:val="36"/>
+        </w:rPr>
+      </w:pPr>
+      <w:r>
+        <w:rPr>
+          <w:b/>
+          <w:bCs/>
+          <w:sz w:val="36"/>
+          <w:szCs w:val="36"/>
+        </w:rPr>
+        <w:t xml:space="preserve">Os 4 pilares da </w:t>
+      </w:r>
+      <w:r>
+        <w:rPr>
+          <w:b/>
+          <w:bCs/>
+          <w:sz w:val="36"/>
+          <w:szCs w:val="36"/>
+        </w:rPr>
+        <w:t>Programação Orientada a Objetos</w:t>
+      </w:r>
+      <w:r>
+        <w:rPr>
+          <w:b/>
+          <w:bCs/>
+          <w:sz w:val="36"/>
+          <w:szCs w:val="36"/>
+        </w:rPr>
+        <w:t>:</w:t>
+      </w:r>
+    </w:p>
+    <w:p>
+      <w:pPr>
+        <w:rPr>
+          <w:b/>
+          <w:bCs/>
+          <w:sz w:val="36"/>
+          <w:szCs w:val="36"/>
+        </w:rPr>
+      </w:pPr>
+      <w:r>
+        <w:rPr>
+          <w:b/>
+          <w:bCs/>
+          <w:sz w:val="32"/>
+          <w:szCs w:val="32"/>
+        </w:rPr>
+        <w:t>Abstração</w:t>
+      </w:r>
+      <w:r>
+        <w:rPr>
+          <w:b/>
+          <w:bCs/>
+          <w:sz w:val="36"/>
+          <w:szCs w:val="36"/>
+        </w:rPr>
+        <w:t>:</w:t>
+      </w:r>
+    </w:p>
+    <w:p>
+      <w:r>
+        <w:t>Capacidade de simplificar as coisas</w:t>
+      </w:r>
+    </w:p>
+    <w:p>
+      <w:pPr>
+        <w:rPr>
+          <w:b/>
+          <w:bCs/>
+          <w:sz w:val="36"/>
+          <w:szCs w:val="36"/>
+        </w:rPr>
+      </w:pPr>
+      <w:r>
+        <w:rPr>
+          <w:b/>
+          <w:bCs/>
+          <w:sz w:val="32"/>
+          <w:szCs w:val="32"/>
+        </w:rPr>
+        <w:t>Encapsulamento</w:t>
+      </w:r>
+      <w:r>
+        <w:rPr>
+          <w:b/>
+          <w:bCs/>
+          <w:sz w:val="36"/>
+          <w:szCs w:val="36"/>
+        </w:rPr>
+        <w:t>:</w:t>
+      </w:r>
+    </w:p>
+    <w:p>
+      <w:r>
+        <w:t>O que vai proteger o código</w:t>
+      </w:r>
+    </w:p>
+    <w:p>
+      <w:pPr>
+        <w:rPr>
+          <w:b/>
+          <w:bCs/>
+          <w:sz w:val="36"/>
+          <w:szCs w:val="36"/>
+        </w:rPr>
+      </w:pPr>
+      <w:r>
+        <w:rPr>
+          <w:b/>
+          <w:bCs/>
+          <w:sz w:val="32"/>
+          <w:szCs w:val="32"/>
+        </w:rPr>
+        <w:t>Herança</w:t>
+      </w:r>
+      <w:r>
+        <w:rPr>
+          <w:b/>
+          <w:bCs/>
+          <w:sz w:val="36"/>
+          <w:szCs w:val="36"/>
+        </w:rPr>
+        <w:t>:</w:t>
+      </w:r>
+    </w:p>
+    <w:p>
+      <w:r>
+        <w:t>Hierarquia dos dados</w:t>
+      </w:r>
+    </w:p>
+    <w:p>
+      <w:pPr>
+        <w:rPr>
+          <w:b/>
+          <w:bCs/>
+          <w:sz w:val="36"/>
+          <w:szCs w:val="36"/>
+        </w:rPr>
+      </w:pPr>
+      <w:r>
+        <w:rPr>
+          <w:b/>
+          <w:bCs/>
+          <w:sz w:val="32"/>
+          <w:szCs w:val="32"/>
+        </w:rPr>
+        <w:t>Polimorfismo</w:t>
+      </w:r>
+      <w:r>
+        <w:rPr>
+          <w:b/>
+          <w:bCs/>
+          <w:sz w:val="36"/>
+          <w:szCs w:val="36"/>
+        </w:rPr>
+        <w:t>:</w:t>
+      </w:r>
+    </w:p>
+    <w:p>
+      <w:r>
+        <w:t xml:space="preserve">A habilidade de criar </w:t>
+      </w:r>
+      <w:r>
+        <w:t>classes</w:t>
+      </w:r>
+      <w:r>
+        <w:t xml:space="preserve"> com o mesmo </w:t>
+      </w:r>
+      <w:r>
+        <w:t>nome,</w:t>
+      </w:r>
+      <w:r>
+        <w:t xml:space="preserve"> mas que fazem coisas diferentes</w:t>
+      </w:r>
+      <w:r>
+        <w:t>, utilizando as outra demais.</w:t>
+      </w:r>
+    </w:p>
+    <w:p/>
+    <w:p>
+      <w:pPr>
+        <w:rPr>
+          <w:b/>
+          <w:bCs/>
+          <w:sz w:val="36"/>
+          <w:szCs w:val="36"/>
+        </w:rPr>
+      </w:pPr>
+      <w:r>
+        <w:rPr>
+          <w:b/>
+          <w:bCs/>
+          <w:sz w:val="36"/>
+          <w:szCs w:val="36"/>
+        </w:rPr>
+        <w:t xml:space="preserve"> </w:t>
+      </w:r>
+    </w:p>
+    <w:p>
+      <w:pPr>
+        <w:rPr>
+          <w:b/>
+          <w:bCs/>
+          <w:sz w:val="36"/>
+          <w:szCs w:val="36"/>
+        </w:rPr>
+      </w:pPr>
+      <w:r>
+        <w:rPr>
+          <w:b/>
+          <w:bCs/>
+          <w:sz w:val="36"/>
+          <w:szCs w:val="36"/>
+        </w:rPr>
+        <w:lastRenderedPageBreak/>
+        <w:t xml:space="preserve">- </w:t>
+      </w:r>
+      <w:r>
+        <w:rPr>
+          <w:b/>
+          <w:bCs/>
+          <w:sz w:val="36"/>
+          <w:szCs w:val="36"/>
+        </w:rPr>
+        <w:t>Herança</w:t>
+      </w:r>
+    </w:p>
+    <w:p>
+      <w:r>
+        <w:t>E</w:t>
+      </w:r>
+      <w:r>
+        <w:t xml:space="preserve"> um relacionamento entre itens gerais </w:t>
+      </w:r>
+      <w:r>
+        <w:t xml:space="preserve">(ancestrais, ou é 1) e tipos mais específicos </w:t>
+      </w:r>
+      <w:r>
+        <w:t>(descendentes) desses itens, que herdam atributos e métodos dos níveis superiores.</w:t>
+      </w:r>
+    </w:p>
+    <w:p>
+      <w:pPr>
+        <w:rPr>
+          <w:b/>
+          <w:bCs/>
+        </w:rPr>
+      </w:pPr>
+      <w:r>
+        <w:rPr>
+          <w:b/>
+          <w:bCs/>
+        </w:rPr>
+        <w:t>Principais</w:t>
+      </w:r>
+      <w:r>
+        <w:rPr>
+          <w:b/>
+          <w:bCs/>
+        </w:rPr>
+        <w:t xml:space="preserve"> Vantagens:</w:t>
+      </w:r>
+    </w:p>
+    <w:p>
+      <w:pPr>
+        <w:pStyle w:val="PargrafodaLista"/>
+        <w:numPr>
+          <w:ilvl w:val="0"/>
+          <w:numId w:val="6"/>
+        </w:numPr>
+      </w:pPr>
+      <w:r>
+        <w:t>Reutilização de código</w:t>
+      </w:r>
+    </w:p>
+    <w:p>
+      <w:pPr>
+        <w:pStyle w:val="PargrafodaLista"/>
+        <w:numPr>
+          <w:ilvl w:val="0"/>
+          <w:numId w:val="6"/>
+        </w:numPr>
+      </w:pPr>
+      <w:r>
+        <w:t>Organização Hierárquica</w:t>
+      </w:r>
+    </w:p>
+    <w:p>
+      <w:pPr>
+        <w:pStyle w:val="PargrafodaLista"/>
+        <w:numPr>
+          <w:ilvl w:val="0"/>
+          <w:numId w:val="6"/>
+        </w:numPr>
+      </w:pPr>
+      <w:r>
+        <w:t>Facilidade de Manutenção</w:t>
+      </w:r>
+    </w:p>
+    <w:p>
+      <w:pPr>
+        <w:pStyle w:val="PargrafodaLista"/>
+        <w:numPr>
+          <w:ilvl w:val="0"/>
+          <w:numId w:val="6"/>
+        </w:numPr>
+      </w:pPr>
+      <w:r>
+        <w:t>Extensibilidade</w:t>
+      </w:r>
+    </w:p>
+    <w:p>
+      <w:pPr>
+        <w:pStyle w:val="PargrafodaLista"/>
+        <w:numPr>
+          <w:ilvl w:val="0"/>
+          <w:numId w:val="6"/>
+        </w:numPr>
+      </w:pPr>
+      <w:r>
+        <w:t>Suporte ao Polimorfismo</w:t>
+      </w:r>
+    </w:p>
+    <w:p>
+      <w:r>
+        <w:t xml:space="preserve">A classe pai é a classe </w:t>
+      </w:r>
+      <w:r>
+        <w:rPr>
+          <w:b/>
+          <w:bCs/>
+        </w:rPr>
+        <w:t>GENERALIZADA</w:t>
+      </w:r>
+      <w:r>
+        <w:t xml:space="preserve">, ou também comum ser chamada de </w:t>
+      </w:r>
+      <w:proofErr w:type="gramStart"/>
+      <w:r>
+        <w:t>super classe</w:t>
+      </w:r>
+      <w:proofErr w:type="gramEnd"/>
+      <w:r>
+        <w:t xml:space="preserve"> e a classe que herda suas características é a classe </w:t>
+      </w:r>
+      <w:r>
+        <w:rPr>
+          <w:b/>
+          <w:bCs/>
+        </w:rPr>
+        <w:t>ESPECIALIZADA</w:t>
+      </w:r>
+      <w:r>
+        <w:t>.</w:t>
+      </w:r>
+    </w:p>
+    <w:p/>
     <w:sectPr>
       <w:pgSz w:w="11906" w:h="16838"/>
       <w:pgMar w:top="1417" w:right="1701" w:bottom="1417" w:left="1701" w:header="708" w:footer="708" w:gutter="0"/>
@@ -2349,6 +2744,119 @@
       </w:rPr>
     </w:lvl>
   </w:abstractNum>
+  <w:abstractNum w:abstractNumId="5" w15:restartNumberingAfterBreak="0">
+    <w:nsid w:val="5AF95DBA"/>
+    <w:multiLevelType w:val="hybridMultilevel"/>
+    <w:tmpl w:val="FE522B3C"/>
+    <w:lvl w:ilvl="0" w:tplc="04160001">
+      <w:start w:val="1"/>
+      <w:numFmt w:val="bullet"/>
+      <w:lvlText w:val=""/>
+      <w:lvlJc w:val="left"/>
+      <w:pPr>
+        <w:ind w:left="720" w:hanging="360"/>
+      </w:pPr>
+      <w:rPr>
+        <w:rFonts w:ascii="Symbol" w:hAnsi="Symbol" w:hint="default"/>
+      </w:rPr>
+    </w:lvl>
+    <w:lvl w:ilvl="1" w:tplc="04160003" w:tentative="1">
+      <w:start w:val="1"/>
+      <w:numFmt w:val="bullet"/>
+      <w:lvlText w:val="o"/>
+      <w:lvlJc w:val="left"/>
+      <w:pPr>
+        <w:ind w:left="1440" w:hanging="360"/>
+      </w:pPr>
+      <w:rPr>
+        <w:rFonts w:ascii="Courier New" w:hAnsi="Courier New" w:cs="Courier New" w:hint="default"/>
+      </w:rPr>
+    </w:lvl>
+    <w:lvl w:ilvl="2" w:tplc="04160005" w:tentative="1">
+      <w:start w:val="1"/>
+      <w:numFmt w:val="bullet"/>
+      <w:lvlText w:val=""/>
+      <w:lvlJc w:val="left"/>
+      <w:pPr>
+        <w:ind w:left="2160" w:hanging="360"/>
+      </w:pPr>
+      <w:rPr>
+        <w:rFonts w:ascii="Wingdings" w:hAnsi="Wingdings" w:hint="default"/>
+      </w:rPr>
+    </w:lvl>
+    <w:lvl w:ilvl="3" w:tplc="04160001" w:tentative="1">
+      <w:start w:val="1"/>
+      <w:numFmt w:val="bullet"/>
+      <w:lvlText w:val=""/>
+      <w:lvlJc w:val="left"/>
+      <w:pPr>
+        <w:ind w:left="2880" w:hanging="360"/>
+      </w:pPr>
+      <w:rPr>
+        <w:rFonts w:ascii="Symbol" w:hAnsi="Symbol" w:hint="default"/>
+      </w:rPr>
+    </w:lvl>
+    <w:lvl w:ilvl="4" w:tplc="04160003" w:tentative="1">
+      <w:start w:val="1"/>
+      <w:numFmt w:val="bullet"/>
+      <w:lvlText w:val="o"/>
+      <w:lvlJc w:val="left"/>
+      <w:pPr>
+        <w:ind w:left="3600" w:hanging="360"/>
+      </w:pPr>
+      <w:rPr>
+        <w:rFonts w:ascii="Courier New" w:hAnsi="Courier New" w:cs="Courier New" w:hint="default"/>
+      </w:rPr>
+    </w:lvl>
+    <w:lvl w:ilvl="5" w:tplc="04160005" w:tentative="1">
+      <w:start w:val="1"/>
+      <w:numFmt w:val="bullet"/>
+      <w:lvlText w:val=""/>
+      <w:lvlJc w:val="left"/>
+      <w:pPr>
+        <w:ind w:left="4320" w:hanging="360"/>
+      </w:pPr>
+      <w:rPr>
+        <w:rFonts w:ascii="Wingdings" w:hAnsi="Wingdings" w:hint="default"/>
+      </w:rPr>
+    </w:lvl>
+    <w:lvl w:ilvl="6" w:tplc="04160001" w:tentative="1">
+      <w:start w:val="1"/>
+      <w:numFmt w:val="bullet"/>
+      <w:lvlText w:val=""/>
+      <w:lvlJc w:val="left"/>
+      <w:pPr>
+        <w:ind w:left="5040" w:hanging="360"/>
+      </w:pPr>
+      <w:rPr>
+        <w:rFonts w:ascii="Symbol" w:hAnsi="Symbol" w:hint="default"/>
+      </w:rPr>
+    </w:lvl>
+    <w:lvl w:ilvl="7" w:tplc="04160003" w:tentative="1">
+      <w:start w:val="1"/>
+      <w:numFmt w:val="bullet"/>
+      <w:lvlText w:val="o"/>
+      <w:lvlJc w:val="left"/>
+      <w:pPr>
+        <w:ind w:left="5760" w:hanging="360"/>
+      </w:pPr>
+      <w:rPr>
+        <w:rFonts w:ascii="Courier New" w:hAnsi="Courier New" w:cs="Courier New" w:hint="default"/>
+      </w:rPr>
+    </w:lvl>
+    <w:lvl w:ilvl="8" w:tplc="04160005" w:tentative="1">
+      <w:start w:val="1"/>
+      <w:numFmt w:val="bullet"/>
+      <w:lvlText w:val=""/>
+      <w:lvlJc w:val="left"/>
+      <w:pPr>
+        <w:ind w:left="6480" w:hanging="360"/>
+      </w:pPr>
+      <w:rPr>
+        <w:rFonts w:ascii="Wingdings" w:hAnsi="Wingdings" w:hint="default"/>
+      </w:rPr>
+    </w:lvl>
+  </w:abstractNum>
   <w:num w:numId="1" w16cid:durableId="1046180861">
     <w:abstractNumId w:val="1"/>
   </w:num>
@@ -2363,6 +2871,9 @@
   </w:num>
   <w:num w:numId="5" w16cid:durableId="1374041265">
     <w:abstractNumId w:val="2"/>
+  </w:num>
+  <w:num w:numId="6" w16cid:durableId="1599754444">
+    <w:abstractNumId w:val="5"/>
   </w:num>
 </w:numbering>
 </file>
@@ -2970,6 +3481,7 @@
   <w:style w:type="character" w:default="1" w:styleId="Fontepargpadro">
     <w:name w:val="Default Paragraph Font"/>
     <w:uiPriority w:val="1"/>
+    <w:semiHidden/>
     <w:unhideWhenUsed/>
   </w:style>
   <w:style w:type="table" w:default="1" w:styleId="Tabelanormal">

</xml_diff>